<commit_message>
fix(partner): close final activation and pilot vr
</commit_message>
<xml_diff>
--- a/docs/legal/01_obchodni-podminky.docx
+++ b/docs/legal/01_obchodni-podminky.docx
@@ -1,8 +1,8 @@
 
 <file path=word/document.xml><?xml version="1.0" encoding="utf-8"?>
-<w:document xmlns:mc="http://schemas.openxmlformats.org/markup-compatibility/2006" xmlns:o="urn:schemas-microsoft-com:office:office" xmlns:r="http://schemas.openxmlformats.org/officeDocument/2006/relationships" xmlns:m="http://schemas.openxmlformats.org/officeDocument/2006/math" xmlns:v="urn:schemas-microsoft-com:vml" xmlns:wp="http://schemas.openxmlformats.org/drawingml/2006/wordprocessingDrawing" xmlns:w10="urn:schemas-microsoft-com:office:word" xmlns:w="http://schemas.openxmlformats.org/wordprocessingml/2006/main" xmlns:wne="http://schemas.microsoft.com/office/word/2006/wordml" xmlns:sl="http://schemas.openxmlformats.org/schemaLibrary/2006/main" xmlns:a="http://schemas.openxmlformats.org/drawingml/2006/main" xmlns:pic="http://schemas.openxmlformats.org/drawingml/2006/picture" xmlns:c="http://schemas.openxmlformats.org/drawingml/2006/chart" xmlns:lc="http://schemas.openxmlformats.org/drawingml/2006/lockedCanvas" xmlns:dgm="http://schemas.openxmlformats.org/drawingml/2006/diagram" xmlns:wps="http://schemas.microsoft.com/office/word/2010/wordprocessingShape" xmlns:wpg="http://schemas.microsoft.com/office/word/2010/wordprocessingGroup" xmlns:w14="http://schemas.microsoft.com/office/word/2010/wordml" xmlns:w15="http://schemas.microsoft.com/office/word/2012/wordml" xmlns:w16="http://schemas.microsoft.com/office/word/2018/wordml" xmlns:w16cex="http://schemas.microsoft.com/office/word/2018/wordml/cex" xmlns:w16cid="http://schemas.microsoft.com/office/word/2016/wordml/cid" xmlns="http://schemas.microsoft.com/office/tasks/2019/documenttasks" xmlns:cr="http://schemas.microsoft.com/office/comments/2020/reactions">
+<w:document xmlns:ns1="http://schemas.microsoft.com/office/word/2010/wordml" xmlns:ns2="http://schemas.openxmlformats.org/officeDocument/2006/relationships" xmlns:w="http://schemas.openxmlformats.org/wordprocessingml/2006/main">
   <w:body>
-    <w:p>
+    <w:p ns1:paraId="00000001">
       <w:pPr>
         <w:spacing w:after="80" w:lineRule="auto"/>
         <w:rPr>
@@ -27,7 +27,7 @@
         </w:rPr>
       </w:r>
     </w:p>
-    <w:p>
+    <w:p ns1:paraId="00000002">
       <w:pPr>
         <w:spacing w:after="200" w:lineRule="auto"/>
         <w:rPr>
@@ -52,7 +52,7 @@
         </w:rPr>
       </w:r>
     </w:p>
-    <w:p>
+    <w:p ns1:paraId="00000003">
       <w:pPr>
         <w:keepNext w:val="1"/>
         <w:spacing w:after="80" w:before="280" w:lineRule="auto"/>
@@ -78,7 +78,7 @@
         </w:rPr>
       </w:r>
     </w:p>
-    <w:p>
+    <w:p ns1:paraId="00000004">
       <w:pPr>
         <w:rPr>
           <w:rFonts w:ascii="Inter" w:cs="Inter" w:eastAsia="Inter" w:hAnsi="Inter"/>
@@ -94,7 +94,7 @@
         <w:t xml:space="preserve">1.2 Právní vztahy nesjednané výslovně v Elektronické objednávce nebo Rámcové smlouvě se řídí těmito VOP a příslušnými ustanoveními občanského zákoníku.</w:t>
       </w:r>
     </w:p>
-    <w:p>
+    <w:p ns1:paraId="00000005">
       <w:pPr>
         <w:keepNext w:val="1"/>
         <w:spacing w:after="80" w:before="280" w:lineRule="auto"/>
@@ -120,7 +120,7 @@
         </w:rPr>
       </w:r>
     </w:p>
-    <w:p>
+    <w:p ns1:paraId="00000006">
       <w:pPr>
         <w:rPr>
           <w:rFonts w:ascii="Inter" w:cs="Inter" w:eastAsia="Inter" w:hAnsi="Inter"/>
@@ -195,6 +195,11 @@
       </w:r>
     </w:p>
     <w:p>
+      <w:r>
+        <w:t>Bankovní účet Poskytovatele: 3452548011/3030 (Air Bank), IBAN CZ3530300000003452548011.</w:t>
+      </w:r>
+    </w:p>
+    <w:p ns1:paraId="00000007">
       <w:pPr>
         <w:keepNext w:val="1"/>
         <w:spacing w:after="80" w:before="280" w:lineRule="auto"/>
@@ -220,7 +225,7 @@
         </w:rPr>
       </w:r>
     </w:p>
-    <w:p>
+    <w:p ns1:paraId="00000008">
       <w:pPr>
         <w:rPr>
           <w:rFonts w:ascii="Inter" w:cs="Inter" w:eastAsia="Inter" w:hAnsi="Inter"/>
@@ -277,7 +282,7 @@
         <w:t xml:space="preserve">Krátkodobé výpadky způsobené plánovanou údržbou nebo nefunkčností cloudové infrastruktury třetích stran nezakládají porušení smlouvy.</w:t>
       </w:r>
     </w:p>
-    <w:p>
+    <w:p ns1:paraId="00000009">
       <w:pPr>
         <w:keepNext w:val="1"/>
         <w:spacing w:after="80" w:before="280" w:lineRule="auto"/>
@@ -303,7 +308,7 @@
         </w:rPr>
       </w:r>
     </w:p>
-    <w:p>
+    <w:p ns1:paraId="0000000A">
       <w:pPr>
         <w:rPr>
           <w:rFonts w:ascii="Inter" w:cs="Inter" w:eastAsia="Inter" w:hAnsi="Inter"/>
@@ -323,7 +328,7 @@
         <w:t>4.6 Prodlení s úhradou: Při prodlení s úhradou delším než 14 dnů je Poskytovatel oprávněn dočasně pozastavit přístup Partnera k platformě až do plného uhrazení dlužné částky.</w:t>
       </w:r>
     </w:p>
-    <w:p>
+    <w:p ns1:paraId="0000000B">
       <w:pPr>
         <w:keepNext w:val="1"/>
         <w:spacing w:after="80" w:before="280" w:lineRule="auto"/>
@@ -345,7 +350,7 @@
         </w:rPr>
       </w:r>
     </w:p>
-    <w:p>
+    <w:p ns1:paraId="0000000C">
       <w:pPr>
         <w:keepNext w:val="1"/>
         <w:spacing w:after="80" w:before="280" w:lineRule="auto"/>
@@ -371,7 +376,7 @@
         </w:rPr>
       </w:r>
     </w:p>
-    <w:p>
+    <w:p ns1:paraId="0000000D">
       <w:pPr>
         <w:rPr>
           <w:rFonts w:ascii="Inter" w:cs="Inter" w:eastAsia="Inter" w:hAnsi="Inter"/>
@@ -428,7 +433,7 @@
         <w:t xml:space="preserve">Pokud Partner se změnou VOP nesouhlasí, je oprávněn změnu odmítnout a smlouvu z tohoto důvodu zrušit písemnou výpovědí s výpovědní dobou 14 dnů.</w:t>
       </w:r>
     </w:p>
-    <w:p>
+    <w:p ns1:paraId="0000000E">
       <w:pPr>
         <w:keepNext w:val="1"/>
         <w:spacing w:after="80" w:before="280" w:lineRule="auto"/>
@@ -454,7 +459,7 @@
         </w:rPr>
       </w:r>
     </w:p>
-    <w:p>
+    <w:p ns1:paraId="0000000F">
       <w:pPr>
         <w:rPr>
           <w:rFonts w:ascii="Inter" w:cs="Inter" w:eastAsia="Inter" w:hAnsi="Inter"/>
@@ -495,8 +500,8 @@
       </w:r>
     </w:p>
     <w:sectPr>
-      <w:headerReference r:id="rId7" w:type="default"/>
-      <w:footerReference r:id="rId8" w:type="default"/>
+      <w:headerReference ns2:id="rId7" w:type="default"/>
+      <w:footerReference ns2:id="rId8" w:type="default"/>
       <w:pgSz w:h="16834" w:w="11909" w:orient="portrait"/>
       <w:pgMar w:bottom="1152" w:top="1152" w:left="1296" w:right="1296" w:header="720" w:footer="720"/>
       <w:pgNumType w:start="1"/>

</xml_diff>